<commit_message>
Robot virtuel 2.2 : 70 gestes, 11 poses, mouvements de scène ; réponse à toutes les directives
- 46 gestes nouveaux (salut militaire, bras au ciel, frapper à la porte, boire, téléphoner,
  écrire, lire, sauter, boxer, tituber, dormir…), 4 poses (effondré, en garde, penseur, statue),
  degré de liberté bassin.elevation (sauts, demi-pointes)
- mouvements composés : tour de la scène, cent pas, pirouette, sortie, entrée, pas chassé, monter, descendre
- correction des fautes de frappe, rapprochement des formulations voisines (188 exemples testés),
  « fais semblant de… », commande « aide » ; toute directive incomprise reçoit une réponse
  (haussement d'épaules, phrase dite, suggestions cliquables)
- ressorts articulaires stables à toute vitesse (pas adaptatif, fréquence plafonnée, butées)

Co-Authored-By: Claude Opus 5.5 <noreply@anthropic.com>
Claude-Session: https://claude.ai/code/session_012H7zRKJBz9iRZoHPUnWaQf
</commit_message>
<xml_diff>
--- a/docs/Guide_robot_virtuel_ROBO-SCENE.docx
+++ b/docs/Guide_robot_virtuel_ROBO-SCENE.docx
@@ -57,7 +57,7 @@
           <w:sz w:val="24"/>
           <w:szCs w:val="24"/>
         </w:rPr>
-        <w:t xml:space="preserve">Guide d'utilisation et fondements — version 2.1</w:t>
+        <w:t xml:space="preserve">Guide d'utilisation et fondements — version 2.2</w:t>
       </w:r>
     </w:p>
     <w:p>
@@ -84,7 +84,7 @@
           <w:sz w:val="22"/>
           <w:szCs w:val="22"/>
         </w:rPr>
-        <w:t xml:space="preserve">15 octobre 2026</w:t>
+        <w:t xml:space="preserve">15 octobre 2026 (révisé)</w:t>
       </w:r>
     </w:p>
     <w:p>
@@ -250,7 +250,7 @@
         <w:pStyle w:val="Heading1"/>
       </w:pPr>
       <w:r>
-        <w:t xml:space="preserve">3. Le corps : trente et un degrés de liberté</w:t>
+        <w:t xml:space="preserve">3. Le corps : trente-deux degrés de liberté</w:t>
       </w:r>
     </w:p>
     <w:p>
@@ -259,7 +259,7 @@
         <w:jc w:val="both"/>
       </w:pPr>
       <w:r>
-        <w:t xml:space="preserve">Le squelette compte trente et un degrés de liberté, décrits dans un fichier unique (</w:t>
+        <w:t xml:space="preserve">Le squelette compte trente-deux degrés de liberté, décrits dans un fichier unique (</w:t>
       </w:r>
       <w:r>
         <w:rPr>
@@ -632,7 +632,7 @@
                 <w:sz w:val="19"/>
                 <w:szCs w:val="19"/>
               </w:rPr>
-              <w:t xml:space="preserve">abaissement (s'asseoir, s'accroupir, s'agenouiller)</w:t>
+              <w:t xml:space="preserve">abaissement (s'asseoir, s'accroupir, s'agenouiller) ; élévation (saut, demi-pointes)</w:t>
             </w:r>
           </w:p>
         </w:tc>
@@ -661,7 +661,7 @@
                 <w:sz w:val="19"/>
                 <w:szCs w:val="19"/>
               </w:rPr>
-              <w:t xml:space="preserve">0 à 55 cm</w:t>
+              <w:t xml:space="preserve">0 à 55 cm ; 0 à 40 cm</w:t>
             </w:r>
           </w:p>
         </w:tc>
@@ -1018,7 +1018,7 @@
         <w:jc w:val="both"/>
       </w:pPr>
       <w:r>
-        <w:t xml:space="preserve">Chaque articulation rejoint sa cible par un ressort amorti du second ordre dont la fréquence et l'amortissement dépendent des facteurs d'effort de Laban associés à l'émotion en cours. Un </w:t>
+        <w:t xml:space="preserve">Chaque articulation rejoint sa cible par un ressort amorti du second ordre, intégré par pas adaptatifs et borné par des butées pour rester stable à toute vitesse, dont la fréquence et l'amortissement dépendent des facteurs d'effort de Laban associés à l'émotion en cours. Un </w:t>
       </w:r>
       <w:r>
         <w:rPr>
@@ -2567,7 +2567,7 @@
         <w:t xml:space="preserve">exécutées</w:t>
       </w:r>
       <w:r>
-        <w:t xml:space="preserve"> dans l'ordre. Ce que les règles ne comprennent pas est affiché en clair.</w:t>
+        <w:t xml:space="preserve"> dans l'ordre. Les fautes de frappe sont corrigées (« lève le brass droit », « sautte ») et les formulations voisines d'une commande connue sont rapprochées de l'un des 188 exemples de référence, avec l'indication « compris comme… » ; chaque exemple est vérifié par un test automatique. Ce qui reste incompris n'est jamais ignoré en silence : le personnage hausse les épaules, le dit à voix haute et propose des commandes proches, et la directive « aide » affiche la liste complète.</w:t>
       </w:r>
     </w:p>
     <w:tbl>
@@ -3213,7 +3213,7 @@
         <w:t xml:space="preserve">Corps</w:t>
       </w:r>
       <w:r>
-        <w:t xml:space="preserve">, qui donne aussi accès à tous les degrés de liberté, à vingt-quatre gestes, à sept poses, aux poses mémorisées et à une </w:t>
+        <w:t xml:space="preserve">, qui donne aussi accès à tous les degrés de liberté, à soixante-dix gestes (vie quotidienne, scène, combat de théâtre), à onze poses (dont effondré, en garde, le penseur et statue), à des mouvements de scène composés (tour de la scène, cent pas, pirouette, sortie, entrée, pas chassé), aux poses mémorisées et à une </w:t>
       </w:r>
       <w:r>
         <w:rPr>
@@ -4311,7 +4311,7 @@
         <w:jc w:val="both"/>
       </w:pPr>
       <w:r>
-        <w:t xml:space="preserve">Huit tests propres au robot virtuel s'ajoutent à la suite de la plateforme (159 tests : 158 réussis, 1 ignoré faute d'un classeur absent du dépôt) : cohérence du schéma, validation et bornage des actions côté pont, interprétation sans modèle et avec un service de modèles simulé (qui vérifie aussi que </w:t>
+        <w:t xml:space="preserve">Neuf tests propres au robot virtuel s'ajoutent à la suite de la plateforme (163 tests : 162 réussis, 1 ignoré faute d'un classeur absent du dépôt), dont un qui exécute les 188 exemples de directives : cohérence du schéma, validation et bornage des actions côté pont, interprétation sans modèle et avec un service de modèles simulé (qui vérifie aussi que </w:t>
       </w:r>
       <w:r>
         <w:rPr>
@@ -4598,7 +4598,7 @@
                 <w:sz w:val="20"/>
                 <w:szCs w:val="20"/>
               </w:rPr>
-              <w:t xml:space="preserve">Mise en conformité vérifiée le 15 octobre 2026</w:t>
+              <w:t xml:space="preserve">Mise en conformité vérifiée le 15 octobre 2026 (révision 2.2)</w:t>
             </w:r>
           </w:p>
           <w:p>
@@ -4682,7 +4682,7 @@
                 <w:sz w:val="21"/>
                 <w:szCs w:val="21"/>
               </w:rPr>
-              <w:t xml:space="preserve"> : double validation des actions (interface et pont), bornage anatomique, commandes physiques via la couche de sécurité, arrêt général relayé au pont, tests automatiques.</w:t>
+              <w:t xml:space="preserve"> : double validation des actions (interface et pont), bornage anatomique, intégration numérique stable à toute vitesse, commandes physiques via la couche de sécurité, arrêt général relayé au pont, tests automatiques.</w:t>
             </w:r>
           </w:p>
           <w:p>

</xml_diff>